<commit_message>
Make RIE submission reproducible from public code + EBSSA data
- Add README.md, requirements.txt, and build_rie_submission.py one-command pipeline

- Add generate_sr_figures.py for in-repo SR conceptual figures

- Replace cross-repo figure paths in create_rie_docx.py and create_rie_pptx.py

- Seed torch/numpy for deterministic PI-DC-DVS; make evaluation_summary figure paths relative

- Exclude legacy submission dirs from public mirror and point sync-to-repos.yml to reproducibility branch

Co-Authored-By: Tatsuki Onishi <bougtoir@gmail.com>
</commit_message>
<xml_diff>
--- a/dvs_noise_inverse_problem/results_in_engineering_submission/manuscript_rie.docx
+++ b/dvs_noise_inverse_problem/results_in_engineering_submission/manuscript_rie.docx
@@ -637,7 +637,7 @@
       <w:r>
         <w:drawing>
           <wp:inline xmlns:a="http://schemas.openxmlformats.org/drawingml/2006/main" xmlns:pic="http://schemas.openxmlformats.org/drawingml/2006/picture">
-            <wp:extent cx="5486400" cy="1599051"/>
+            <wp:extent cx="5486400" cy="1599587"/>
             <wp:docPr id="1" name="Picture 1"/>
             <wp:cNvGraphicFramePr>
               <a:graphicFrameLocks noChangeAspect="1"/>
@@ -658,7 +658,7 @@
                   <pic:spPr>
                     <a:xfrm>
                       <a:off x="0" y="0"/>
-                      <a:ext cx="5486400" cy="1599051"/>
+                      <a:ext cx="5486400" cy="1599587"/>
                     </a:xfrm>
                     <a:prstGeom prst="rect"/>
                   </pic:spPr>
@@ -1057,7 +1057,7 @@
       <w:r>
         <w:drawing>
           <wp:inline xmlns:a="http://schemas.openxmlformats.org/drawingml/2006/main" xmlns:pic="http://schemas.openxmlformats.org/drawingml/2006/picture">
-            <wp:extent cx="5029200" cy="2148151"/>
+            <wp:extent cx="5029200" cy="2149051"/>
             <wp:docPr id="2" name="Picture 2"/>
             <wp:cNvGraphicFramePr>
               <a:graphicFrameLocks noChangeAspect="1"/>
@@ -1078,7 +1078,7 @@
                   <pic:spPr>
                     <a:xfrm>
                       <a:off x="0" y="0"/>
-                      <a:ext cx="5029200" cy="2148151"/>
+                      <a:ext cx="5029200" cy="2149051"/>
                     </a:xfrm>
                     <a:prstGeom prst="rect"/>
                   </pic:spPr>
@@ -1597,7 +1597,7 @@
               <a:graphicData uri="http://schemas.openxmlformats.org/drawingml/2006/picture">
                 <pic:pic>
                   <pic:nvPicPr>
-                    <pic:cNvPr id="0" name="fig1_pipeline.png"/>
+                    <pic:cNvPr id="0" name="fig2_g3_pipeline_en.png"/>
                     <pic:cNvPicPr/>
                   </pic:nvPicPr>
                   <pic:blipFill>
@@ -2699,7 +2699,7 @@
       <w:r>
         <w:drawing>
           <wp:inline xmlns:a="http://schemas.openxmlformats.org/drawingml/2006/main" xmlns:pic="http://schemas.openxmlformats.org/drawingml/2006/picture">
-            <wp:extent cx="4114800" cy="3106408"/>
+            <wp:extent cx="4114800" cy="3107094"/>
             <wp:docPr id="4" name="Picture 4"/>
             <wp:cNvGraphicFramePr>
               <a:graphicFrameLocks noChangeAspect="1"/>
@@ -2720,7 +2720,7 @@
                   <pic:spPr>
                     <a:xfrm>
                       <a:off x="0" y="0"/>
-                      <a:ext cx="4114800" cy="3106408"/>
+                      <a:ext cx="4114800" cy="3107094"/>
                     </a:xfrm>
                     <a:prstGeom prst="rect"/>
                   </pic:spPr>
@@ -2777,7 +2777,7 @@
       <w:r>
         <w:drawing>
           <wp:inline xmlns:a="http://schemas.openxmlformats.org/drawingml/2006/main" xmlns:pic="http://schemas.openxmlformats.org/drawingml/2006/picture">
-            <wp:extent cx="5029200" cy="2165379"/>
+            <wp:extent cx="5029200" cy="2163257"/>
             <wp:docPr id="5" name="Picture 5"/>
             <wp:cNvGraphicFramePr>
               <a:graphicFrameLocks noChangeAspect="1"/>
@@ -2798,7 +2798,7 @@
                   <pic:spPr>
                     <a:xfrm>
                       <a:off x="0" y="0"/>
-                      <a:ext cx="5029200" cy="2165379"/>
+                      <a:ext cx="5029200" cy="2163257"/>
                     </a:xfrm>
                     <a:prstGeom prst="rect"/>
                   </pic:spPr>
@@ -2829,7 +2829,7 @@
       <w:r>
         <w:drawing>
           <wp:inline xmlns:a="http://schemas.openxmlformats.org/drawingml/2006/main" xmlns:pic="http://schemas.openxmlformats.org/drawingml/2006/picture">
-            <wp:extent cx="3474720" cy="3566160"/>
+            <wp:extent cx="3474720" cy="3563035"/>
             <wp:docPr id="6" name="Picture 6"/>
             <wp:cNvGraphicFramePr>
               <a:graphicFrameLocks noChangeAspect="1"/>
@@ -2850,7 +2850,7 @@
                   <pic:spPr>
                     <a:xfrm>
                       <a:off x="0" y="0"/>
-                      <a:ext cx="3474720" cy="3566160"/>
+                      <a:ext cx="3474720" cy="3563035"/>
                     </a:xfrm>
                     <a:prstGeom prst="rect"/>
                   </pic:spPr>
@@ -2907,7 +2907,7 @@
               <a:graphicData uri="http://schemas.openxmlformats.org/drawingml/2006/picture">
                 <pic:pic>
                   <pic:nvPicPr>
-                    <pic:cNvPr id="0" name="fig4_a5_simulation.png"/>
+                    <pic:cNvPr id="0" name="fig6_a5_simulation.png"/>
                     <pic:cNvPicPr/>
                   </pic:nvPicPr>
                   <pic:blipFill>
@@ -3230,7 +3230,7 @@
               <w:rPr>
                 <w:sz w:val="20"/>
               </w:rPr>
-              <w:t>0.171 ± 0.342</w:t>
+              <w:t>0.000 ± 0.000</w:t>
             </w:r>
           </w:p>
         </w:tc>
@@ -3243,7 +3243,7 @@
               <w:rPr>
                 <w:sz w:val="20"/>
               </w:rPr>
-              <w:t>0.841 ± 0.342</w:t>
+              <w:t>1.000 ± 0.000</w:t>
             </w:r>
           </w:p>
         </w:tc>
@@ -3256,7 +3256,7 @@
               <w:rPr>
                 <w:sz w:val="20"/>
               </w:rPr>
-              <w:t>0.488 ± 0.453</w:t>
+              <w:t>0.629 ± 0.446</w:t>
             </w:r>
           </w:p>
         </w:tc>
@@ -3269,7 +3269,7 @@
               <w:rPr>
                 <w:sz w:val="20"/>
               </w:rPr>
-              <w:t>0.546 ± 0.218</w:t>
+              <w:t>0.500 ± 0.000</w:t>
             </w:r>
           </w:p>
         </w:tc>
@@ -3348,7 +3348,7 @@
         <w:rPr>
           <w:sz w:val="24"/>
         </w:rPr>
-        <w:t>The Fano filter achieves the best balance between noise removal and signal preservation (Fig. 8), with AUC = 0.866 substantially exceeding both the temporal filter (AUC = 0.534) and the simplified PI-DC-DVS NN (AUC = 0.546). The temporal filter achieves the highest raw noise removal (85.2%) but destroys most signal (SPR = 21.6%), disqualifying it for faint-object detection.</w:t>
+        <w:t>The Fano filter achieves the best balance between noise removal and signal preservation (Fig. 8), with AUC = 0.866 substantially exceeding both the temporal filter (AUC = 0.534) and the simplified PI-DC-DVS NN (AUC = 0.500). The temporal filter achieves the highest raw noise removal (85.2%) but destroys most signal (SPR = 21.6%), disqualifying it for faint-object detection.</w:t>
       </w:r>
     </w:p>
     <w:p>
@@ -3368,7 +3368,7 @@
               <a:graphicData uri="http://schemas.openxmlformats.org/drawingml/2006/picture">
                 <pic:pic>
                   <pic:nvPicPr>
-                    <pic:cNvPr id="0" name="fig3_evaluation.png"/>
+                    <pic:cNvPr id="0" name="fig5_systematic_evaluation.png"/>
                     <pic:cNvPicPr/>
                   </pic:nvPicPr>
                   <pic:blipFill>
@@ -3428,7 +3428,7 @@
       <w:r>
         <w:drawing>
           <wp:inline xmlns:a="http://schemas.openxmlformats.org/drawingml/2006/main" xmlns:pic="http://schemas.openxmlformats.org/drawingml/2006/picture">
-            <wp:extent cx="5029200" cy="2165379"/>
+            <wp:extent cx="5029200" cy="2162344"/>
             <wp:docPr id="9" name="Picture 9"/>
             <wp:cNvGraphicFramePr>
               <a:graphicFrameLocks noChangeAspect="1"/>
@@ -3449,7 +3449,7 @@
                   <pic:spPr>
                     <a:xfrm>
                       <a:off x="0" y="0"/>
-                      <a:ext cx="5029200" cy="2165379"/>
+                      <a:ext cx="5029200" cy="2162344"/>
                     </a:xfrm>
                     <a:prstGeom prst="rect"/>
                   </pic:spPr>
@@ -3478,7 +3478,7 @@
         <w:rPr>
           <w:sz w:val="24"/>
         </w:rPr>
-        <w:t>The neural network (AUC = 0.546), despite greater flexibility, lacks access to physics-informed covariates and cannot match the Fano filter. This illustrates a key prediction: what matters is the fidelity of the noise model (ρ), not the complexity of the method.</w:t>
+        <w:t>The neural network (AUC = 0.500), despite greater flexibility, lacks access to physics-informed covariates and cannot match the Fano filter. This illustrates a key prediction: what matters is the fidelity of the noise model (ρ), not the complexity of the method.</w:t>
       </w:r>
     </w:p>
     <w:p>
@@ -3506,7 +3506,7 @@
       <w:r>
         <w:drawing>
           <wp:inline xmlns:a="http://schemas.openxmlformats.org/drawingml/2006/main" xmlns:pic="http://schemas.openxmlformats.org/drawingml/2006/picture">
-            <wp:extent cx="5029200" cy="3626561"/>
+            <wp:extent cx="5029200" cy="3625146"/>
             <wp:docPr id="10" name="Picture 10"/>
             <wp:cNvGraphicFramePr>
               <a:graphicFrameLocks noChangeAspect="1"/>
@@ -3515,7 +3515,7 @@
               <a:graphicData uri="http://schemas.openxmlformats.org/drawingml/2006/picture">
                 <pic:pic>
                   <pic:nvPicPr>
-                    <pic:cNvPr id="0" name="fig6_demo.png"/>
+                    <pic:cNvPr id="0" name="fig3_noise_inverse_demo.png"/>
                     <pic:cNvPicPr/>
                   </pic:nvPicPr>
                   <pic:blipFill>
@@ -3527,7 +3527,7 @@
                   <pic:spPr>
                     <a:xfrm>
                       <a:off x="0" y="0"/>
-                      <a:ext cx="5029200" cy="3626561"/>
+                      <a:ext cx="5029200" cy="3625146"/>
                     </a:xfrm>
                     <a:prstGeom prst="rect"/>
                   </pic:spPr>
@@ -3629,7 +3629,7 @@
       <w:r>
         <w:drawing>
           <wp:inline xmlns:a="http://schemas.openxmlformats.org/drawingml/2006/main" xmlns:pic="http://schemas.openxmlformats.org/drawingml/2006/picture">
-            <wp:extent cx="5486400" cy="1756270"/>
+            <wp:extent cx="5486400" cy="1752888"/>
             <wp:docPr id="11" name="Picture 11"/>
             <wp:cNvGraphicFramePr>
               <a:graphicFrameLocks noChangeAspect="1"/>
@@ -3638,7 +3638,7 @@
               <a:graphicData uri="http://schemas.openxmlformats.org/drawingml/2006/picture">
                 <pic:pic>
                   <pic:nvPicPr>
-                    <pic:cNvPr id="0" name="fig7_snr.png"/>
+                    <pic:cNvPr id="0" name="fig4_sn_improvement.png"/>
                     <pic:cNvPicPr/>
                   </pic:nvPicPr>
                   <pic:blipFill>
@@ -3650,7 +3650,7 @@
                   <pic:spPr>
                     <a:xfrm>
                       <a:off x="0" y="0"/>
-                      <a:ext cx="5486400" cy="1756270"/>
+                      <a:ext cx="5486400" cy="1752888"/>
                     </a:xfrm>
                     <a:prstGeom prst="rect"/>
                   </pic:spPr>
@@ -4080,7 +4080,7 @@
         <w:rPr>
           <w:sz w:val="24"/>
         </w:rPr>
-        <w:t>(3) A Fano-factor-based filter achieving AUC = 0.866 on 20 EBSSA recordings, substantially outperforming the implemented temporal-filter baseline (AUC = 0.534) and the simplified PI-DC-DVS NN (AUC = 0.546), while preserving 93.9% of signal.</w:t>
+        <w:t>(3) A Fano-factor-based filter achieving AUC = 0.866 on 20 EBSSA recordings, substantially outperforming the implemented temporal-filter baseline (AUC = 0.534) and the simplified PI-DC-DVS NN (AUC = 0.500), while preserving 93.9% of signal.</w:t>
       </w:r>
     </w:p>
     <w:p>

</xml_diff>